<commit_message>
v5.5 : Add initial draft of AI research paper by Anisha Paturi
</commit_message>
<xml_diff>
--- a/PS1_Review1.docx
+++ b/PS1_Review1.docx
@@ -1,6 +1,6 @@
 
 <file path=word/document.xml><?xml version="1.0" encoding="utf-8"?>
-<w:document xmlns:wpc="http://schemas.microsoft.com/office/word/2010/wordprocessingCanvas" xmlns:cx="http://schemas.microsoft.com/office/drawing/2014/chartex" xmlns:cx1="http://schemas.microsoft.com/office/drawing/2015/9/8/chartex" xmlns:cx2="http://schemas.microsoft.com/office/drawing/2015/10/21/chartex" xmlns:cx3="http://schemas.microsoft.com/office/drawing/2016/5/9/chartex" xmlns:cx4="http://schemas.microsoft.com/office/drawing/2016/5/10/chartex" xmlns:cx5="http://schemas.microsoft.com/office/drawing/2016/5/11/chartex" xmlns:cx6="http://schemas.microsoft.com/office/drawing/2016/5/12/chartex" xmlns:cx7="http://schemas.microsoft.com/office/drawing/2016/5/13/chartex" xmlns:cx8="http://schemas.microsoft.com/office/drawing/2016/5/14/chartex" xmlns:mc="http://schemas.openxmlformats.org/markup-compatibility/2006" xmlns:aink="http://schemas.microsoft.com/office/drawing/2016/ink" xmlns:am3d="http://schemas.microsoft.com/office/drawing/2017/model3d" xmlns:o="urn:schemas-microsoft-com:office:office" xmlns:oel="http://schemas.microsoft.com/office/2019/extlst" xmlns:r="http://schemas.openxmlformats.org/officeDocument/2006/relationships" xmlns:m="http://schemas.openxmlformats.org/officeDocument/2006/math" xmlns:v="urn:schemas-microsoft-com:vml" xmlns:wp14="http://schemas.microsoft.com/office/word/2010/wordprocessingDrawing" xmlns:wp="http://schemas.openxmlformats.org/drawingml/2006/wordprocessingDrawing" xmlns:w10="urn:schemas-microsoft-com:office:word" xmlns:w="http://schemas.openxmlformats.org/wordprocessingml/2006/main" xmlns:w14="http://schemas.microsoft.com/office/word/2010/wordml" xmlns:w15="http://schemas.microsoft.com/office/word/2012/wordml" xmlns:w16cex="http://schemas.microsoft.com/office/word/2018/wordml/cex" xmlns:w16cid="http://schemas.microsoft.com/office/word/2016/wordml/cid" xmlns:w16="http://schemas.microsoft.com/office/word/2018/wordml" xmlns:w16du="http://schemas.microsoft.com/office/word/2023/wordml/word16du" xmlns:w16sdtdh="http://schemas.microsoft.com/office/word/2020/wordml/sdtdatahash" xmlns:w16sdtfl="http://schemas.microsoft.com/office/word/2024/wordml/sdtformatlock" xmlns:w16se="http://schemas.microsoft.com/office/word/2015/wordml/symex" xmlns:wpg="http://schemas.microsoft.com/office/word/2010/wordprocessingGroup" xmlns:wpi="http://schemas.microsoft.com/office/word/2010/wordprocessingInk" xmlns:wne="http://schemas.microsoft.com/office/word/2006/wordml" xmlns:wps="http://schemas.microsoft.com/office/word/2010/wordprocessingShape" mc:Ignorable="w14 w15 w16se w16cid w16 w16cex w16sdtdh w16sdtfl w16du wp14">
+<w:document xmlns:wpc="http://schemas.microsoft.com/office/word/2010/wordprocessingCanvas" xmlns:cx="http://schemas.microsoft.com/office/drawing/2014/chartex" xmlns:cx1="http://schemas.microsoft.com/office/drawing/2015/9/8/chartex" xmlns:cx2="http://schemas.microsoft.com/office/drawing/2015/10/21/chartex" xmlns:cx3="http://schemas.microsoft.com/office/drawing/2016/5/9/chartex" xmlns:cx4="http://schemas.microsoft.com/office/drawing/2016/5/10/chartex" xmlns:cx5="http://schemas.microsoft.com/office/drawing/2016/5/11/chartex" xmlns:cx6="http://schemas.microsoft.com/office/drawing/2016/5/12/chartex" xmlns:cx7="http://schemas.microsoft.com/office/drawing/2016/5/13/chartex" xmlns:cx8="http://schemas.microsoft.com/office/drawing/2016/5/14/chartex" xmlns:mc="http://schemas.openxmlformats.org/markup-compatibility/2006" xmlns:aink="http://schemas.microsoft.com/office/drawing/2016/ink" xmlns:am3d="http://schemas.microsoft.com/office/drawing/2017/model3d" xmlns:o="urn:schemas-microsoft-com:office:office" xmlns:oel="http://schemas.microsoft.com/office/2019/extlst" xmlns:r="http://schemas.openxmlformats.org/officeDocument/2006/relationships" xmlns:m="http://schemas.openxmlformats.org/officeDocument/2006/math" xmlns:v="urn:schemas-microsoft-com:vml" xmlns:wp14="http://schemas.microsoft.com/office/word/2010/wordprocessingDrawing" xmlns:wp="http://schemas.openxmlformats.org/drawingml/2006/wordprocessingDrawing" xmlns:w10="urn:schemas-microsoft-com:office:word" xmlns:w="http://schemas.openxmlformats.org/wordprocessingml/2006/main" xmlns:w14="http://schemas.microsoft.com/office/word/2010/wordml" xmlns:w15="http://schemas.microsoft.com/office/word/2012/wordml" xmlns:w16cei="http://schemas.microsoft.com/office/word/2026/wordml/cei" xmlns:w16cex="http://schemas.microsoft.com/office/word/2018/wordml/cex" xmlns:w16cid="http://schemas.microsoft.com/office/word/2016/wordml/cid" xmlns:w16="http://schemas.microsoft.com/office/word/2018/wordml" xmlns:w16du="http://schemas.microsoft.com/office/word/2023/wordml/word16du" xmlns:w16sdtdh="http://schemas.microsoft.com/office/word/2020/wordml/sdtdatahash" xmlns:w16sdtfl="http://schemas.microsoft.com/office/word/2024/wordml/sdtformatlock" xmlns:w16se="http://schemas.microsoft.com/office/word/2015/wordml/symex" xmlns:wpg="http://schemas.microsoft.com/office/word/2010/wordprocessingGroup" xmlns:wpi="http://schemas.microsoft.com/office/word/2010/wordprocessingInk" xmlns:wne="http://schemas.microsoft.com/office/word/2006/wordml" xmlns:wps="http://schemas.microsoft.com/office/word/2010/wordprocessingShape" mc:Ignorable="w14 w15 w16se w16cid w16 w16cex w16sdtdh w16sdtfl w16du wp14">
   <w:body>
     <w:p>
       <w:pPr>
@@ -229,6 +229,14 @@
         </w:rPr>
         <w:t xml:space="preserve"> </w:t>
       </w:r>
+      <w:r>
+        <w:rPr>
+          <w:rFonts w:ascii="Times New Roman" w:hAnsi="Times New Roman" w:cs="Times New Roman"/>
+          <w:b/>
+          <w:sz w:val="24"/>
+        </w:rPr>
+        <w:t>3/08/2026</w:t>
+      </w:r>
     </w:p>
     <w:p>
       <w:pPr>
@@ -260,7 +268,16 @@
           <w:sz w:val="24"/>
           <w:szCs w:val="24"/>
         </w:rPr>
-        <w:t xml:space="preserve"> CSE - C</w:t>
+        <w:t xml:space="preserve"> CSE - </w:t>
+      </w:r>
+      <w:r>
+        <w:rPr>
+          <w:rFonts w:ascii="Times New Roman" w:hAnsi="Times New Roman" w:cs="Times New Roman"/>
+          <w:b/>
+          <w:sz w:val="24"/>
+          <w:szCs w:val="24"/>
+        </w:rPr>
+        <w:t>A</w:t>
       </w:r>
       <w:r>
         <w:rPr>
@@ -372,82 +389,105 @@
           <w:b/>
           <w:sz w:val="24"/>
         </w:rPr>
-        <w:tab/>
-      </w:r>
-      <w:r>
-        <w:rPr>
-          <w:rFonts w:ascii="Times New Roman" w:hAnsi="Times New Roman" w:cs="Times New Roman"/>
-          <w:b/>
-          <w:sz w:val="24"/>
-        </w:rPr>
-        <w:tab/>
-      </w:r>
-      <w:r>
-        <w:rPr>
-          <w:rFonts w:ascii="Times New Roman" w:hAnsi="Times New Roman" w:cs="Times New Roman"/>
-          <w:b/>
-          <w:sz w:val="24"/>
-        </w:rPr>
-        <w:tab/>
-      </w:r>
-      <w:r>
-        <w:rPr>
-          <w:rFonts w:ascii="Times New Roman" w:hAnsi="Times New Roman" w:cs="Times New Roman"/>
-          <w:b/>
-          <w:sz w:val="24"/>
-        </w:rPr>
-        <w:tab/>
-      </w:r>
-      <w:r>
-        <w:rPr>
-          <w:rFonts w:ascii="Times New Roman" w:hAnsi="Times New Roman" w:cs="Times New Roman"/>
-          <w:b/>
-          <w:sz w:val="24"/>
-        </w:rPr>
-        <w:tab/>
-      </w:r>
-      <w:r>
-        <w:rPr>
-          <w:rFonts w:ascii="Times New Roman" w:hAnsi="Times New Roman" w:cs="Times New Roman"/>
-          <w:b/>
-          <w:sz w:val="24"/>
-        </w:rPr>
-        <w:tab/>
-      </w:r>
-      <w:r>
-        <w:rPr>
-          <w:rFonts w:ascii="Times New Roman" w:hAnsi="Times New Roman" w:cs="Times New Roman"/>
-          <w:b/>
-          <w:sz w:val="24"/>
-        </w:rPr>
-        <w:tab/>
-      </w:r>
-      <w:r>
-        <w:rPr>
-          <w:rFonts w:ascii="Times New Roman" w:hAnsi="Times New Roman" w:cs="Times New Roman"/>
-          <w:b/>
-          <w:sz w:val="24"/>
-          <w:szCs w:val="24"/>
-        </w:rPr>
-        <w:t xml:space="preserve">Faculty </w:t>
-      </w:r>
-      <w:r>
-        <w:rPr>
-          <w:rFonts w:ascii="Times New Roman" w:hAnsi="Times New Roman" w:cs="Times New Roman"/>
-          <w:b/>
-          <w:sz w:val="24"/>
-          <w:szCs w:val="24"/>
-        </w:rPr>
-        <w:t xml:space="preserve">Supervisor: </w:t>
-      </w:r>
-      <w:r>
-        <w:rPr>
-          <w:rFonts w:ascii="Times New Roman" w:hAnsi="Times New Roman" w:cs="Times New Roman"/>
-          <w:b/>
-          <w:sz w:val="24"/>
-          <w:szCs w:val="24"/>
-        </w:rPr>
-        <w:tab/>
+        <w:t xml:space="preserve">13                          </w:t>
+      </w:r>
+      <w:r>
+        <w:rPr>
+          <w:rFonts w:ascii="Times New Roman" w:hAnsi="Times New Roman" w:cs="Times New Roman"/>
+          <w:b/>
+          <w:sz w:val="24"/>
+        </w:rPr>
+        <w:tab/>
+      </w:r>
+      <w:r>
+        <w:rPr>
+          <w:rFonts w:ascii="Times New Roman" w:hAnsi="Times New Roman" w:cs="Times New Roman"/>
+          <w:b/>
+          <w:sz w:val="24"/>
+        </w:rPr>
+        <w:tab/>
+      </w:r>
+      <w:r>
+        <w:rPr>
+          <w:rFonts w:ascii="Times New Roman" w:hAnsi="Times New Roman" w:cs="Times New Roman"/>
+          <w:b/>
+          <w:sz w:val="24"/>
+        </w:rPr>
+        <w:tab/>
+      </w:r>
+      <w:r>
+        <w:rPr>
+          <w:rFonts w:ascii="Times New Roman" w:hAnsi="Times New Roman" w:cs="Times New Roman"/>
+          <w:b/>
+          <w:sz w:val="24"/>
+        </w:rPr>
+        <w:tab/>
+      </w:r>
+      <w:r>
+        <w:rPr>
+          <w:rFonts w:ascii="Times New Roman" w:hAnsi="Times New Roman" w:cs="Times New Roman"/>
+          <w:b/>
+          <w:sz w:val="24"/>
+        </w:rPr>
+        <w:tab/>
+      </w:r>
+      <w:r>
+        <w:rPr>
+          <w:rFonts w:ascii="Times New Roman" w:hAnsi="Times New Roman" w:cs="Times New Roman"/>
+          <w:b/>
+          <w:sz w:val="24"/>
+          <w:szCs w:val="24"/>
+        </w:rPr>
+        <w:t>Faculty</w:t>
+      </w:r>
+      <w:r>
+        <w:rPr>
+          <w:rFonts w:ascii="Times New Roman" w:hAnsi="Times New Roman" w:cs="Times New Roman"/>
+          <w:b/>
+          <w:sz w:val="24"/>
+          <w:szCs w:val="24"/>
+        </w:rPr>
+        <w:t xml:space="preserve"> </w:t>
+      </w:r>
+      <w:r>
+        <w:rPr>
+          <w:rFonts w:ascii="Times New Roman" w:hAnsi="Times New Roman" w:cs="Times New Roman"/>
+          <w:b/>
+          <w:sz w:val="24"/>
+          <w:szCs w:val="24"/>
+        </w:rPr>
+        <w:t>Supervisor:</w:t>
+      </w:r>
+      <w:r>
+        <w:rPr>
+          <w:rFonts w:ascii="Times New Roman" w:hAnsi="Times New Roman" w:cs="Times New Roman"/>
+          <w:b/>
+          <w:sz w:val="24"/>
+          <w:szCs w:val="24"/>
+        </w:rPr>
+        <w:t xml:space="preserve"> </w:t>
+      </w:r>
+      <w:proofErr w:type="spellStart"/>
+      <w:proofErr w:type="gramStart"/>
+      <w:r>
+        <w:rPr>
+          <w:rFonts w:ascii="Times New Roman" w:hAnsi="Times New Roman" w:cs="Times New Roman"/>
+          <w:b/>
+          <w:sz w:val="24"/>
+          <w:szCs w:val="24"/>
+        </w:rPr>
+        <w:t>Dr.Vishal</w:t>
+      </w:r>
+      <w:proofErr w:type="spellEnd"/>
+      <w:proofErr w:type="gramEnd"/>
+      <w:r>
+        <w:rPr>
+          <w:rFonts w:ascii="Times New Roman" w:hAnsi="Times New Roman" w:cs="Times New Roman"/>
+          <w:b/>
+          <w:sz w:val="24"/>
+          <w:szCs w:val="24"/>
+        </w:rPr>
+        <w:t xml:space="preserve"> Reddy</w:t>
       </w:r>
       <w:r>
         <w:rPr>
@@ -607,6 +647,12 @@
                 <w:sz w:val="24"/>
               </w:rPr>
             </w:pPr>
+            <w:r>
+              <w:rPr>
+                <w:sz w:val="24"/>
+              </w:rPr>
+              <w:t>23BD1A050E</w:t>
+            </w:r>
           </w:p>
         </w:tc>
         <w:tc>
@@ -618,10 +664,20 @@
               <w:jc w:val="center"/>
               <w:rPr>
                 <w:rFonts w:ascii="Times New Roman" w:hAnsi="Times New Roman" w:cs="Times New Roman"/>
-                <w:b/>
-                <w:sz w:val="48"/>
+                <w:bCs/>
+                <w:sz w:val="28"/>
+                <w:szCs w:val="28"/>
               </w:rPr>
             </w:pPr>
+            <w:r>
+              <w:rPr>
+                <w:rFonts w:ascii="Times New Roman" w:hAnsi="Times New Roman" w:cs="Times New Roman"/>
+                <w:bCs/>
+                <w:sz w:val="28"/>
+                <w:szCs w:val="28"/>
+              </w:rPr>
+              <w:t>Anisha Paturi</w:t>
+            </w:r>
           </w:p>
         </w:tc>
         <w:tc>
@@ -657,6 +713,12 @@
                 <w:sz w:val="24"/>
               </w:rPr>
             </w:pPr>
+            <w:r>
+              <w:rPr>
+                <w:sz w:val="24"/>
+              </w:rPr>
+              <w:t>23BD1A0518</w:t>
+            </w:r>
           </w:p>
         </w:tc>
         <w:tc>
@@ -668,10 +730,20 @@
               <w:jc w:val="center"/>
               <w:rPr>
                 <w:rFonts w:ascii="Times New Roman" w:hAnsi="Times New Roman" w:cs="Times New Roman"/>
-                <w:b/>
-                <w:sz w:val="48"/>
+                <w:bCs/>
+                <w:sz w:val="28"/>
+                <w:szCs w:val="28"/>
               </w:rPr>
             </w:pPr>
+            <w:r>
+              <w:rPr>
+                <w:rFonts w:ascii="Times New Roman" w:hAnsi="Times New Roman" w:cs="Times New Roman"/>
+                <w:bCs/>
+                <w:sz w:val="28"/>
+                <w:szCs w:val="28"/>
+              </w:rPr>
+              <w:t>Ch Venkata Vahini</w:t>
+            </w:r>
           </w:p>
         </w:tc>
         <w:tc>
@@ -710,6 +782,12 @@
                 <w:sz w:val="24"/>
               </w:rPr>
             </w:pPr>
+            <w:r>
+              <w:rPr>
+                <w:sz w:val="24"/>
+              </w:rPr>
+              <w:t>23BD1A051D</w:t>
+            </w:r>
           </w:p>
         </w:tc>
         <w:tc>
@@ -724,10 +802,20 @@
               <w:jc w:val="center"/>
               <w:rPr>
                 <w:rFonts w:ascii="Times New Roman" w:hAnsi="Times New Roman" w:cs="Times New Roman"/>
-                <w:b/>
-                <w:sz w:val="48"/>
+                <w:bCs/>
+                <w:sz w:val="28"/>
+                <w:szCs w:val="28"/>
               </w:rPr>
             </w:pPr>
+            <w:r>
+              <w:rPr>
+                <w:rFonts w:ascii="Times New Roman" w:hAnsi="Times New Roman" w:cs="Times New Roman"/>
+                <w:bCs/>
+                <w:sz w:val="28"/>
+                <w:szCs w:val="28"/>
+              </w:rPr>
+              <w:t>Ch Parinamika Bhanu</w:t>
+            </w:r>
           </w:p>
         </w:tc>
         <w:tc>
@@ -769,6 +857,12 @@
                 <w:sz w:val="24"/>
               </w:rPr>
             </w:pPr>
+            <w:r>
+              <w:rPr>
+                <w:sz w:val="24"/>
+              </w:rPr>
+              <w:t>23BD1A051Y</w:t>
+            </w:r>
           </w:p>
         </w:tc>
         <w:tc>
@@ -786,10 +880,20 @@
               <w:jc w:val="center"/>
               <w:rPr>
                 <w:rFonts w:ascii="Times New Roman" w:hAnsi="Times New Roman" w:cs="Times New Roman"/>
-                <w:b/>
-                <w:sz w:val="48"/>
+                <w:bCs/>
+                <w:sz w:val="28"/>
+                <w:szCs w:val="28"/>
               </w:rPr>
             </w:pPr>
+            <w:r>
+              <w:rPr>
+                <w:rFonts w:ascii="Times New Roman" w:hAnsi="Times New Roman" w:cs="Times New Roman"/>
+                <w:bCs/>
+                <w:sz w:val="28"/>
+                <w:szCs w:val="28"/>
+              </w:rPr>
+              <w:t>Sravani Janak</w:t>
+            </w:r>
           </w:p>
         </w:tc>
         <w:tc>
@@ -1149,6 +1253,7 @@
       <w:r>
         <w:rPr>
           <w:rFonts w:ascii="Times New Roman" w:hAnsi="Times New Roman" w:cs="Times New Roman"/>
+          <w:noProof/>
           <w:sz w:val="28"/>
           <w:lang w:val="en-IN"/>
         </w:rPr>
@@ -1223,7 +1328,7 @@
 </file>
 
 <file path=word/endnotes.xml><?xml version="1.0" encoding="utf-8"?>
-<w:endnotes xmlns:wpc="http://schemas.microsoft.com/office/word/2010/wordprocessingCanvas" xmlns:cx="http://schemas.microsoft.com/office/drawing/2014/chartex" xmlns:cx1="http://schemas.microsoft.com/office/drawing/2015/9/8/chartex" xmlns:cx2="http://schemas.microsoft.com/office/drawing/2015/10/21/chartex" xmlns:cx3="http://schemas.microsoft.com/office/drawing/2016/5/9/chartex" xmlns:cx4="http://schemas.microsoft.com/office/drawing/2016/5/10/chartex" xmlns:cx5="http://schemas.microsoft.com/office/drawing/2016/5/11/chartex" xmlns:cx6="http://schemas.microsoft.com/office/drawing/2016/5/12/chartex" xmlns:cx7="http://schemas.microsoft.com/office/drawing/2016/5/13/chartex" xmlns:cx8="http://schemas.microsoft.com/office/drawing/2016/5/14/chartex" xmlns:mc="http://schemas.openxmlformats.org/markup-compatibility/2006" xmlns:aink="http://schemas.microsoft.com/office/drawing/2016/ink" xmlns:am3d="http://schemas.microsoft.com/office/drawing/2017/model3d" xmlns:o="urn:schemas-microsoft-com:office:office" xmlns:oel="http://schemas.microsoft.com/office/2019/extlst" xmlns:r="http://schemas.openxmlformats.org/officeDocument/2006/relationships" xmlns:m="http://schemas.openxmlformats.org/officeDocument/2006/math" xmlns:v="urn:schemas-microsoft-com:vml" xmlns:wp14="http://schemas.microsoft.com/office/word/2010/wordprocessingDrawing" xmlns:wp="http://schemas.openxmlformats.org/drawingml/2006/wordprocessingDrawing" xmlns:w10="urn:schemas-microsoft-com:office:word" xmlns:w="http://schemas.openxmlformats.org/wordprocessingml/2006/main" xmlns:w14="http://schemas.microsoft.com/office/word/2010/wordml" xmlns:w15="http://schemas.microsoft.com/office/word/2012/wordml" xmlns:w16cex="http://schemas.microsoft.com/office/word/2018/wordml/cex" xmlns:w16cid="http://schemas.microsoft.com/office/word/2016/wordml/cid" xmlns:w16="http://schemas.microsoft.com/office/word/2018/wordml" xmlns:w16du="http://schemas.microsoft.com/office/word/2023/wordml/word16du" xmlns:w16sdtdh="http://schemas.microsoft.com/office/word/2020/wordml/sdtdatahash" xmlns:w16sdtfl="http://schemas.microsoft.com/office/word/2024/wordml/sdtformatlock" xmlns:w16se="http://schemas.microsoft.com/office/word/2015/wordml/symex" xmlns:wpg="http://schemas.microsoft.com/office/word/2010/wordprocessingGroup" xmlns:wpi="http://schemas.microsoft.com/office/word/2010/wordprocessingInk" xmlns:wne="http://schemas.microsoft.com/office/word/2006/wordml" xmlns:wps="http://schemas.microsoft.com/office/word/2010/wordprocessingShape" mc:Ignorable="w14 w15 w16se w16cid w16 w16cex w16sdtdh w16sdtfl w16du wp14">
+<w:endnotes xmlns:wpc="http://schemas.microsoft.com/office/word/2010/wordprocessingCanvas" xmlns:cx="http://schemas.microsoft.com/office/drawing/2014/chartex" xmlns:cx1="http://schemas.microsoft.com/office/drawing/2015/9/8/chartex" xmlns:cx2="http://schemas.microsoft.com/office/drawing/2015/10/21/chartex" xmlns:cx3="http://schemas.microsoft.com/office/drawing/2016/5/9/chartex" xmlns:cx4="http://schemas.microsoft.com/office/drawing/2016/5/10/chartex" xmlns:cx5="http://schemas.microsoft.com/office/drawing/2016/5/11/chartex" xmlns:cx6="http://schemas.microsoft.com/office/drawing/2016/5/12/chartex" xmlns:cx7="http://schemas.microsoft.com/office/drawing/2016/5/13/chartex" xmlns:cx8="http://schemas.microsoft.com/office/drawing/2016/5/14/chartex" xmlns:mc="http://schemas.openxmlformats.org/markup-compatibility/2006" xmlns:aink="http://schemas.microsoft.com/office/drawing/2016/ink" xmlns:am3d="http://schemas.microsoft.com/office/drawing/2017/model3d" xmlns:o="urn:schemas-microsoft-com:office:office" xmlns:oel="http://schemas.microsoft.com/office/2019/extlst" xmlns:r="http://schemas.openxmlformats.org/officeDocument/2006/relationships" xmlns:m="http://schemas.openxmlformats.org/officeDocument/2006/math" xmlns:v="urn:schemas-microsoft-com:vml" xmlns:wp14="http://schemas.microsoft.com/office/word/2010/wordprocessingDrawing" xmlns:wp="http://schemas.openxmlformats.org/drawingml/2006/wordprocessingDrawing" xmlns:w10="urn:schemas-microsoft-com:office:word" xmlns:w="http://schemas.openxmlformats.org/wordprocessingml/2006/main" xmlns:w14="http://schemas.microsoft.com/office/word/2010/wordml" xmlns:w15="http://schemas.microsoft.com/office/word/2012/wordml" xmlns:w16cei="http://schemas.microsoft.com/office/word/2026/wordml/cei" xmlns:w16cex="http://schemas.microsoft.com/office/word/2018/wordml/cex" xmlns:w16cid="http://schemas.microsoft.com/office/word/2016/wordml/cid" xmlns:w16="http://schemas.microsoft.com/office/word/2018/wordml" xmlns:w16du="http://schemas.microsoft.com/office/word/2023/wordml/word16du" xmlns:w16sdtdh="http://schemas.microsoft.com/office/word/2020/wordml/sdtdatahash" xmlns:w16sdtfl="http://schemas.microsoft.com/office/word/2024/wordml/sdtformatlock" xmlns:w16se="http://schemas.microsoft.com/office/word/2015/wordml/symex" xmlns:wpg="http://schemas.microsoft.com/office/word/2010/wordprocessingGroup" xmlns:wpi="http://schemas.microsoft.com/office/word/2010/wordprocessingInk" xmlns:wne="http://schemas.microsoft.com/office/word/2006/wordml" xmlns:wps="http://schemas.microsoft.com/office/word/2010/wordprocessingShape" mc:Ignorable="w14 w15 w16se w16cid w16 w16cex w16sdtdh w16sdtfl w16du wp14">
   <w:endnote w:type="separator" w:id="-1">
     <w:p>
       <w:pPr>
@@ -1248,7 +1353,7 @@
 </file>
 
 <file path=word/footnotes.xml><?xml version="1.0" encoding="utf-8"?>
-<w:footnotes xmlns:wpc="http://schemas.microsoft.com/office/word/2010/wordprocessingCanvas" xmlns:cx="http://schemas.microsoft.com/office/drawing/2014/chartex" xmlns:cx1="http://schemas.microsoft.com/office/drawing/2015/9/8/chartex" xmlns:cx2="http://schemas.microsoft.com/office/drawing/2015/10/21/chartex" xmlns:cx3="http://schemas.microsoft.com/office/drawing/2016/5/9/chartex" xmlns:cx4="http://schemas.microsoft.com/office/drawing/2016/5/10/chartex" xmlns:cx5="http://schemas.microsoft.com/office/drawing/2016/5/11/chartex" xmlns:cx6="http://schemas.microsoft.com/office/drawing/2016/5/12/chartex" xmlns:cx7="http://schemas.microsoft.com/office/drawing/2016/5/13/chartex" xmlns:cx8="http://schemas.microsoft.com/office/drawing/2016/5/14/chartex" xmlns:mc="http://schemas.openxmlformats.org/markup-compatibility/2006" xmlns:aink="http://schemas.microsoft.com/office/drawing/2016/ink" xmlns:am3d="http://schemas.microsoft.com/office/drawing/2017/model3d" xmlns:o="urn:schemas-microsoft-com:office:office" xmlns:oel="http://schemas.microsoft.com/office/2019/extlst" xmlns:r="http://schemas.openxmlformats.org/officeDocument/2006/relationships" xmlns:m="http://schemas.openxmlformats.org/officeDocument/2006/math" xmlns:v="urn:schemas-microsoft-com:vml" xmlns:wp14="http://schemas.microsoft.com/office/word/2010/wordprocessingDrawing" xmlns:wp="http://schemas.openxmlformats.org/drawingml/2006/wordprocessingDrawing" xmlns:w10="urn:schemas-microsoft-com:office:word" xmlns:w="http://schemas.openxmlformats.org/wordprocessingml/2006/main" xmlns:w14="http://schemas.microsoft.com/office/word/2010/wordml" xmlns:w15="http://schemas.microsoft.com/office/word/2012/wordml" xmlns:w16cex="http://schemas.microsoft.com/office/word/2018/wordml/cex" xmlns:w16cid="http://schemas.microsoft.com/office/word/2016/wordml/cid" xmlns:w16="http://schemas.microsoft.com/office/word/2018/wordml" xmlns:w16du="http://schemas.microsoft.com/office/word/2023/wordml/word16du" xmlns:w16sdtdh="http://schemas.microsoft.com/office/word/2020/wordml/sdtdatahash" xmlns:w16sdtfl="http://schemas.microsoft.com/office/word/2024/wordml/sdtformatlock" xmlns:w16se="http://schemas.microsoft.com/office/word/2015/wordml/symex" xmlns:wpg="http://schemas.microsoft.com/office/word/2010/wordprocessingGroup" xmlns:wpi="http://schemas.microsoft.com/office/word/2010/wordprocessingInk" xmlns:wne="http://schemas.microsoft.com/office/word/2006/wordml" xmlns:wps="http://schemas.microsoft.com/office/word/2010/wordprocessingShape" mc:Ignorable="w14 w15 w16se w16cid w16 w16cex w16sdtdh w16sdtfl w16du wp14">
+<w:footnotes xmlns:wpc="http://schemas.microsoft.com/office/word/2010/wordprocessingCanvas" xmlns:cx="http://schemas.microsoft.com/office/drawing/2014/chartex" xmlns:cx1="http://schemas.microsoft.com/office/drawing/2015/9/8/chartex" xmlns:cx2="http://schemas.microsoft.com/office/drawing/2015/10/21/chartex" xmlns:cx3="http://schemas.microsoft.com/office/drawing/2016/5/9/chartex" xmlns:cx4="http://schemas.microsoft.com/office/drawing/2016/5/10/chartex" xmlns:cx5="http://schemas.microsoft.com/office/drawing/2016/5/11/chartex" xmlns:cx6="http://schemas.microsoft.com/office/drawing/2016/5/12/chartex" xmlns:cx7="http://schemas.microsoft.com/office/drawing/2016/5/13/chartex" xmlns:cx8="http://schemas.microsoft.com/office/drawing/2016/5/14/chartex" xmlns:mc="http://schemas.openxmlformats.org/markup-compatibility/2006" xmlns:aink="http://schemas.microsoft.com/office/drawing/2016/ink" xmlns:am3d="http://schemas.microsoft.com/office/drawing/2017/model3d" xmlns:o="urn:schemas-microsoft-com:office:office" xmlns:oel="http://schemas.microsoft.com/office/2019/extlst" xmlns:r="http://schemas.openxmlformats.org/officeDocument/2006/relationships" xmlns:m="http://schemas.openxmlformats.org/officeDocument/2006/math" xmlns:v="urn:schemas-microsoft-com:vml" xmlns:wp14="http://schemas.microsoft.com/office/word/2010/wordprocessingDrawing" xmlns:wp="http://schemas.openxmlformats.org/drawingml/2006/wordprocessingDrawing" xmlns:w10="urn:schemas-microsoft-com:office:word" xmlns:w="http://schemas.openxmlformats.org/wordprocessingml/2006/main" xmlns:w14="http://schemas.microsoft.com/office/word/2010/wordml" xmlns:w15="http://schemas.microsoft.com/office/word/2012/wordml" xmlns:w16cei="http://schemas.microsoft.com/office/word/2026/wordml/cei" xmlns:w16cex="http://schemas.microsoft.com/office/word/2018/wordml/cex" xmlns:w16cid="http://schemas.microsoft.com/office/word/2016/wordml/cid" xmlns:w16="http://schemas.microsoft.com/office/word/2018/wordml" xmlns:w16du="http://schemas.microsoft.com/office/word/2023/wordml/word16du" xmlns:w16sdtdh="http://schemas.microsoft.com/office/word/2020/wordml/sdtdatahash" xmlns:w16sdtfl="http://schemas.microsoft.com/office/word/2024/wordml/sdtformatlock" xmlns:w16se="http://schemas.microsoft.com/office/word/2015/wordml/symex" xmlns:wpg="http://schemas.microsoft.com/office/word/2010/wordprocessingGroup" xmlns:wpi="http://schemas.microsoft.com/office/word/2010/wordprocessingInk" xmlns:wne="http://schemas.microsoft.com/office/word/2006/wordml" xmlns:wps="http://schemas.microsoft.com/office/word/2010/wordprocessingShape" mc:Ignorable="w14 w15 w16se w16cid w16 w16cex w16sdtdh w16sdtfl w16du wp14">
   <w:footnote w:type="separator" w:id="-1">
     <w:p>
       <w:pPr>
@@ -1273,7 +1378,7 @@
 </file>
 
 <file path=word/header1.xml><?xml version="1.0" encoding="utf-8"?>
-<w:hdr xmlns:wpc="http://schemas.microsoft.com/office/word/2010/wordprocessingCanvas" xmlns:cx="http://schemas.microsoft.com/office/drawing/2014/chartex" xmlns:cx1="http://schemas.microsoft.com/office/drawing/2015/9/8/chartex" xmlns:cx2="http://schemas.microsoft.com/office/drawing/2015/10/21/chartex" xmlns:cx3="http://schemas.microsoft.com/office/drawing/2016/5/9/chartex" xmlns:cx4="http://schemas.microsoft.com/office/drawing/2016/5/10/chartex" xmlns:cx5="http://schemas.microsoft.com/office/drawing/2016/5/11/chartex" xmlns:cx6="http://schemas.microsoft.com/office/drawing/2016/5/12/chartex" xmlns:cx7="http://schemas.microsoft.com/office/drawing/2016/5/13/chartex" xmlns:cx8="http://schemas.microsoft.com/office/drawing/2016/5/14/chartex" xmlns:mc="http://schemas.openxmlformats.org/markup-compatibility/2006" xmlns:aink="http://schemas.microsoft.com/office/drawing/2016/ink" xmlns:am3d="http://schemas.microsoft.com/office/drawing/2017/model3d" xmlns:o="urn:schemas-microsoft-com:office:office" xmlns:oel="http://schemas.microsoft.com/office/2019/extlst" xmlns:r="http://schemas.openxmlformats.org/officeDocument/2006/relationships" xmlns:m="http://schemas.openxmlformats.org/officeDocument/2006/math" xmlns:v="urn:schemas-microsoft-com:vml" xmlns:wp14="http://schemas.microsoft.com/office/word/2010/wordprocessingDrawing" xmlns:wp="http://schemas.openxmlformats.org/drawingml/2006/wordprocessingDrawing" xmlns:w10="urn:schemas-microsoft-com:office:word" xmlns:w="http://schemas.openxmlformats.org/wordprocessingml/2006/main" xmlns:w14="http://schemas.microsoft.com/office/word/2010/wordml" xmlns:w15="http://schemas.microsoft.com/office/word/2012/wordml" xmlns:w16cex="http://schemas.microsoft.com/office/word/2018/wordml/cex" xmlns:w16cid="http://schemas.microsoft.com/office/word/2016/wordml/cid" xmlns:w16="http://schemas.microsoft.com/office/word/2018/wordml" xmlns:w16du="http://schemas.microsoft.com/office/word/2023/wordml/word16du" xmlns:w16sdtdh="http://schemas.microsoft.com/office/word/2020/wordml/sdtdatahash" xmlns:w16sdtfl="http://schemas.microsoft.com/office/word/2024/wordml/sdtformatlock" xmlns:w16se="http://schemas.microsoft.com/office/word/2015/wordml/symex" xmlns:wpg="http://schemas.microsoft.com/office/word/2010/wordprocessingGroup" xmlns:wpi="http://schemas.microsoft.com/office/word/2010/wordprocessingInk" xmlns:wne="http://schemas.microsoft.com/office/word/2006/wordml" xmlns:wps="http://schemas.microsoft.com/office/word/2010/wordprocessingShape" mc:Ignorable="w14 w15 w16se w16cid w16 w16cex w16sdtdh w16sdtfl w16du wp14">
+<w:hdr xmlns:wpc="http://schemas.microsoft.com/office/word/2010/wordprocessingCanvas" xmlns:cx="http://schemas.microsoft.com/office/drawing/2014/chartex" xmlns:cx1="http://schemas.microsoft.com/office/drawing/2015/9/8/chartex" xmlns:cx2="http://schemas.microsoft.com/office/drawing/2015/10/21/chartex" xmlns:cx3="http://schemas.microsoft.com/office/drawing/2016/5/9/chartex" xmlns:cx4="http://schemas.microsoft.com/office/drawing/2016/5/10/chartex" xmlns:cx5="http://schemas.microsoft.com/office/drawing/2016/5/11/chartex" xmlns:cx6="http://schemas.microsoft.com/office/drawing/2016/5/12/chartex" xmlns:cx7="http://schemas.microsoft.com/office/drawing/2016/5/13/chartex" xmlns:cx8="http://schemas.microsoft.com/office/drawing/2016/5/14/chartex" xmlns:mc="http://schemas.openxmlformats.org/markup-compatibility/2006" xmlns:aink="http://schemas.microsoft.com/office/drawing/2016/ink" xmlns:am3d="http://schemas.microsoft.com/office/drawing/2017/model3d" xmlns:o="urn:schemas-microsoft-com:office:office" xmlns:oel="http://schemas.microsoft.com/office/2019/extlst" xmlns:r="http://schemas.openxmlformats.org/officeDocument/2006/relationships" xmlns:m="http://schemas.openxmlformats.org/officeDocument/2006/math" xmlns:v="urn:schemas-microsoft-com:vml" xmlns:wp14="http://schemas.microsoft.com/office/word/2010/wordprocessingDrawing" xmlns:wp="http://schemas.openxmlformats.org/drawingml/2006/wordprocessingDrawing" xmlns:w10="urn:schemas-microsoft-com:office:word" xmlns:w="http://schemas.openxmlformats.org/wordprocessingml/2006/main" xmlns:w14="http://schemas.microsoft.com/office/word/2010/wordml" xmlns:w15="http://schemas.microsoft.com/office/word/2012/wordml" xmlns:w16cei="http://schemas.microsoft.com/office/word/2026/wordml/cei" xmlns:w16cex="http://schemas.microsoft.com/office/word/2018/wordml/cex" xmlns:w16cid="http://schemas.microsoft.com/office/word/2016/wordml/cid" xmlns:w16="http://schemas.microsoft.com/office/word/2018/wordml" xmlns:w16du="http://schemas.microsoft.com/office/word/2023/wordml/word16du" xmlns:w16sdtdh="http://schemas.microsoft.com/office/word/2020/wordml/sdtdatahash" xmlns:w16sdtfl="http://schemas.microsoft.com/office/word/2024/wordml/sdtformatlock" xmlns:w16se="http://schemas.microsoft.com/office/word/2015/wordml/symex" xmlns:wpg="http://schemas.microsoft.com/office/word/2010/wordprocessingGroup" xmlns:wpi="http://schemas.microsoft.com/office/word/2010/wordprocessingInk" xmlns:wne="http://schemas.microsoft.com/office/word/2006/wordml" xmlns:wps="http://schemas.microsoft.com/office/word/2010/wordprocessingShape" mc:Ignorable="w14 w15 w16se w16cid w16 w16cex w16sdtdh w16sdtfl w16du wp14">
   <w:p>
     <w:pPr>
       <w:pStyle w:val="Normal1"/>
@@ -1439,7 +1544,25 @@
         <w:sz w:val="16"/>
         <w:szCs w:val="16"/>
       </w:rPr>
-      <w:t>(AN AUTONOMOUS INSTITUT</w:t>
+      <w:t>(</w:t>
+    </w:r>
+    <w:proofErr w:type="gramStart"/>
+    <w:r>
+      <w:rPr>
+        <w:rFonts w:ascii="Arial Black" w:eastAsia="Arial Black" w:hAnsi="Arial Black" w:cs="Arial Black"/>
+        <w:sz w:val="16"/>
+        <w:szCs w:val="16"/>
+      </w:rPr>
+      <w:t>AN AUTONOMOUS</w:t>
+    </w:r>
+    <w:proofErr w:type="gramEnd"/>
+    <w:r>
+      <w:rPr>
+        <w:rFonts w:ascii="Arial Black" w:eastAsia="Arial Black" w:hAnsi="Arial Black" w:cs="Arial Black"/>
+        <w:sz w:val="16"/>
+        <w:szCs w:val="16"/>
+      </w:rPr>
+      <w:t xml:space="preserve"> INSTITUT</w:t>
     </w:r>
     <w:r>
       <w:rPr>
@@ -1916,6 +2039,7 @@
   <w:style w:type="character" w:default="1" w:styleId="DefaultParagraphFont">
     <w:name w:val="Default Paragraph Font"/>
     <w:uiPriority w:val="1"/>
+    <w:semiHidden/>
     <w:unhideWhenUsed/>
   </w:style>
   <w:style w:type="table" w:default="1" w:styleId="TableNormal">

</xml_diff>